<commit_message>
Update to Python documentation
FW9.2.2 broke the Python documentation. This is updated to work.

Change-Id: If172ae7de57a555f390da653d944c1791c59764f
</commit_message>
<xml_diff>
--- a/HelpResourcesSources/TechnicalNotes/Python for FlexTools and FLEx 9.1.docx
+++ b/HelpResourcesSources/TechnicalNotes/Python for FlexTools and FLEx 9.1.docx
@@ -37,19 +37,25 @@
         <w:rPr>
           <w:szCs w:val="36"/>
         </w:rPr>
-        <w:t xml:space="preserve">July </w:t>
+        <w:t>August</w:t>
       </w:r>
       <w:r>
         <w:rPr>
           <w:szCs w:val="36"/>
         </w:rPr>
+        <w:t xml:space="preserve"> </w:t>
+      </w:r>
+      <w:r>
+        <w:rPr>
+          <w:szCs w:val="36"/>
+        </w:rPr>
         <w:t>1</w:t>
       </w:r>
       <w:r>
         <w:rPr>
           <w:szCs w:val="36"/>
         </w:rPr>
-        <w:t>7</w:t>
+        <w:t>5</w:t>
       </w:r>
       <w:r>
         <w:rPr>
@@ -78,8 +84,6 @@
         <w:fldChar w:fldCharType="separate"/>
       </w:r>
     </w:p>
-    <w:bookmarkStart w:id="1" w:name="_GoBack"/>
-    <w:bookmarkEnd w:id="1"/>
     <w:p>
       <w:pPr>
         <w:pStyle w:val="TOC1"/>
@@ -94,108 +98,63 @@
           <w:lang w:eastAsia="en-US" w:bidi="he-IL"/>
         </w:rPr>
       </w:pPr>
-      <w:r>
-        <w:rPr>
-          <w:rStyle w:val="Hyperlink"/>
-          <w:noProof/>
-        </w:rPr>
-        <w:fldChar w:fldCharType="begin"/>
-      </w:r>
-      <w:r>
-        <w:rPr>
-          <w:rStyle w:val="Hyperlink"/>
-          <w:noProof/>
-        </w:rPr>
-        <w:instrText xml:space="preserve"> </w:instrText>
-      </w:r>
-      <w:r>
-        <w:rPr>
-          <w:noProof/>
-        </w:rPr>
-        <w:instrText>HYPERLINK \l "_Toc172137538"</w:instrText>
-      </w:r>
-      <w:r>
-        <w:rPr>
-          <w:rStyle w:val="Hyperlink"/>
-          <w:noProof/>
-        </w:rPr>
-        <w:instrText xml:space="preserve"> </w:instrText>
-      </w:r>
-      <w:r>
-        <w:rPr>
-          <w:rStyle w:val="Hyperlink"/>
-          <w:noProof/>
-        </w:rPr>
-      </w:r>
-      <w:r>
-        <w:rPr>
-          <w:rStyle w:val="Hyperlink"/>
-          <w:noProof/>
-        </w:rPr>
-        <w:fldChar w:fldCharType="separate"/>
-      </w:r>
-      <w:r>
-        <w:rPr>
-          <w:rStyle w:val="Hyperlink"/>
-          <w:noProof/>
-        </w:rPr>
-        <w:t>Python for FlexTools and FLEx 9.1</w:t>
-      </w:r>
-      <w:r>
-        <w:rPr>
-          <w:noProof/>
-          <w:webHidden/>
-        </w:rPr>
-        <w:tab/>
-      </w:r>
-      <w:r>
-        <w:rPr>
-          <w:noProof/>
-          <w:webHidden/>
-        </w:rPr>
-        <w:fldChar w:fldCharType="begin"/>
-      </w:r>
-      <w:r>
-        <w:rPr>
-          <w:noProof/>
-          <w:webHidden/>
-        </w:rPr>
-        <w:instrText xml:space="preserve"> PAGEREF _Toc172137538 \h </w:instrText>
-      </w:r>
-      <w:r>
-        <w:rPr>
-          <w:noProof/>
-          <w:webHidden/>
-        </w:rPr>
-      </w:r>
-      <w:r>
-        <w:rPr>
-          <w:noProof/>
-          <w:webHidden/>
-        </w:rPr>
-        <w:fldChar w:fldCharType="separate"/>
-      </w:r>
-      <w:r>
-        <w:rPr>
-          <w:noProof/>
-          <w:webHidden/>
-        </w:rPr>
-        <w:t>1</w:t>
-      </w:r>
-      <w:r>
-        <w:rPr>
-          <w:noProof/>
-          <w:webHidden/>
-        </w:rPr>
-        <w:fldChar w:fldCharType="end"/>
-      </w:r>
-      <w:r>
-        <w:rPr>
-          <w:rStyle w:val="Hyperlink"/>
-          <w:noProof/>
-        </w:rPr>
-        <w:fldChar w:fldCharType="end"/>
-      </w:r>
+      <w:hyperlink w:anchor="_Toc172137538" w:history="1">
+        <w:r>
+          <w:rPr>
+            <w:rStyle w:val="Hyperlink"/>
+            <w:noProof/>
+          </w:rPr>
+          <w:t>Python for FlexTools and FLEx 9.1</w:t>
+        </w:r>
+        <w:r>
+          <w:rPr>
+            <w:noProof/>
+            <w:webHidden/>
+          </w:rPr>
+          <w:tab/>
+        </w:r>
+        <w:r>
+          <w:rPr>
+            <w:noProof/>
+            <w:webHidden/>
+          </w:rPr>
+          <w:fldChar w:fldCharType="begin"/>
+        </w:r>
+        <w:r>
+          <w:rPr>
+            <w:noProof/>
+            <w:webHidden/>
+          </w:rPr>
+          <w:instrText xml:space="preserve"> PAGEREF _Toc172137538 \h </w:instrText>
+        </w:r>
+        <w:r>
+          <w:rPr>
+            <w:noProof/>
+            <w:webHidden/>
+          </w:rPr>
+        </w:r>
+        <w:r>
+          <w:rPr>
+            <w:noProof/>
+            <w:webHidden/>
+          </w:rPr>
+          <w:fldChar w:fldCharType="separate"/>
+        </w:r>
+        <w:r>
+          <w:rPr>
+            <w:noProof/>
+            <w:webHidden/>
+          </w:rPr>
+          <w:t>1</w:t>
+        </w:r>
+        <w:r>
+          <w:rPr>
+            <w:noProof/>
+            <w:webHidden/>
+          </w:rPr>
+          <w:fldChar w:fldCharType="end"/>
+        </w:r>
+      </w:hyperlink>
     </w:p>
     <w:p>
       <w:pPr>
@@ -591,7 +550,17 @@
             <w:rFonts w:eastAsia="SimSun"/>
             <w:noProof/>
           </w:rPr>
-          <w:t>Class of object using __class__</w:t>
+          <w:t>Clas</w:t>
+        </w:r>
+        <w:bookmarkStart w:id="1" w:name="_GoBack"/>
+        <w:bookmarkEnd w:id="1"/>
+        <w:r>
+          <w:rPr>
+            <w:rStyle w:val="Hyperlink"/>
+            <w:rFonts w:eastAsia="SimSun"/>
+            <w:noProof/>
+          </w:rPr>
+          <w:t>s of object using __class__</w:t>
         </w:r>
         <w:r>
           <w:rPr>
@@ -5455,7 +5424,13 @@
         <w:t>cache</w:t>
       </w:r>
       <w:r>
-        <w:t>.ServiceLocator.GetInstance(ILexEntryFactory).Create()</w:t>
+        <w:t>.ServiceLocator.</w:t>
+      </w:r>
+      <w:r>
+        <w:t>GetService(</w:t>
+      </w:r>
+      <w:r>
+        <w:t>ILexEntryFactory).Create()</w:t>
       </w:r>
       <w:r>
         <w:br/>
@@ -5552,7 +5527,13 @@
         <w:t>cache</w:t>
       </w:r>
       <w:r>
-        <w:t>.ServiceLocator.GetInstance(IUndoStackManager)</w:t>
+        <w:t>.ServiceLocator.</w:t>
+      </w:r>
+      <w:r>
+        <w:t>GetService(</w:t>
+      </w:r>
+      <w:r>
+        <w:t>IUndoStackManager)</w:t>
       </w:r>
       <w:r>
         <w:t>.Save()</w:t>
@@ -5778,11 +5759,17 @@
         <w:t>cache</w:t>
       </w:r>
       <w:r>
-        <w:t>.ServiceLocator.GetInstance</w:t>
+        <w:t>.ServiceLocator.</w:t>
+      </w:r>
+      <w:r>
+        <w:t>GetService</w:t>
       </w:r>
       <w:proofErr w:type="gramEnd"/>
       <w:r>
-        <w:t>(ILexEntryFactory).Create()</w:t>
+        <w:t>(</w:t>
+      </w:r>
+      <w:r>
+        <w:t>ILexEntryFactory).Create()</w:t>
       </w:r>
       <w:r>
         <w:br/>
@@ -5882,11 +5869,17 @@
         <w:t>cache</w:t>
       </w:r>
       <w:r>
-        <w:t>.ServiceLocator.GetInstance</w:t>
+        <w:t>.ServiceLocator.</w:t>
+      </w:r>
+      <w:r>
+        <w:t>GetService</w:t>
       </w:r>
       <w:proofErr w:type="gramEnd"/>
       <w:r>
-        <w:t>(ILexEntryFactory).Create()</w:t>
+        <w:t>(</w:t>
+      </w:r>
+      <w:r>
+        <w:t>ILexEntryFactory).Create()</w:t>
       </w:r>
       <w:r>
         <w:br/>
@@ -5985,7 +5978,13 @@
         <w:t>cache</w:t>
       </w:r>
       <w:r>
-        <w:t>.ServiceLocator.GetInstance(ILexEntryFactory).Create()</w:t>
+        <w:t>.ServiceLocator.</w:t>
+      </w:r>
+      <w:r>
+        <w:t>GetService(</w:t>
+      </w:r>
+      <w:r>
+        <w:t>ILexEntryFactory).Create()</w:t>
       </w:r>
       <w:r>
         <w:br/>
@@ -6071,11 +6070,17 @@
         <w:t>cache</w:t>
       </w:r>
       <w:r>
-        <w:t>.ServiceLocator.GetInstance</w:t>
+        <w:t>.ServiceLocator.</w:t>
+      </w:r>
+      <w:r>
+        <w:t>GetService</w:t>
       </w:r>
       <w:proofErr w:type="gramEnd"/>
       <w:r>
-        <w:t>(ILexEntryFactory).Create()</w:t>
+        <w:t>(</w:t>
+      </w:r>
+      <w:r>
+        <w:t>ILexEntryFactory).Create()</w:t>
       </w:r>
       <w:r>
         <w:br/>
@@ -6129,11 +6134,17 @@
         <w:t>cache</w:t>
       </w:r>
       <w:r>
-        <w:t>.ServiceLocator.GetInstance</w:t>
+        <w:t>.ServiceLocator.</w:t>
+      </w:r>
+      <w:r>
+        <w:t>GetService</w:t>
       </w:r>
       <w:proofErr w:type="gramEnd"/>
       <w:r>
-        <w:t>(ILexEntryFactory).Create()</w:t>
+        <w:t>(</w:t>
+      </w:r>
+      <w:r>
+        <w:t>ILexEntryFactory).Create()</w:t>
       </w:r>
       <w:r>
         <w:br/>
@@ -6175,7 +6186,13 @@
         <w:t>cache</w:t>
       </w:r>
       <w:r>
-        <w:t>.ServiceLocator.GetInstance(ILexEntryFactory).Create()</w:t>
+        <w:t>.ServiceLocator.</w:t>
+      </w:r>
+      <w:r>
+        <w:t>GetService(</w:t>
+      </w:r>
+      <w:r>
+        <w:t>ILexEntryFactory).Create()</w:t>
       </w:r>
       <w:r>
         <w:br/>
@@ -7843,69 +7860,58 @@
         <w:rPr>
           <w:lang w:val="de-DE"/>
         </w:rPr>
-        <w:t>If you want to get all writing systems in a Multi</w:t>
+        <w:t>If you want to get all writing systems in a MultiString</w:t>
       </w:r>
       <w:r>
         <w:rPr>
           <w:lang w:val="de-DE"/>
         </w:rPr>
-        <w:t>String</w:t>
+        <w:t>dir</w:t>
       </w:r>
       <w:r>
         <w:rPr>
           <w:lang w:val="de-DE"/>
         </w:rPr>
-        <w:t>dir</w:t>
-      </w:r>
-      <w:r>
+        <w:t>, you can use the following method. The first line returns an array with all of the writing system codes in the property that have data, whether they are hidden or not. The second line gives the number returned. The following two lines loop through the returned codes listing the code and string content.</w:t>
+      </w:r>
+    </w:p>
+    <w:p>
+      <w:pPr>
+        <w:pStyle w:val="Example"/>
         <w:rPr>
           <w:lang w:val="de-DE"/>
         </w:rPr>
-        <w:t>, you can use the following method. The first line returns an array with all of the writing system codes in the property that have data, whether they are hidden or not. The second line gives the number returned. The following two lines loop through the returned codes listing the code and string content.</w:t>
-      </w:r>
-    </w:p>
-    <w:p>
-      <w:pPr>
-        <w:pStyle w:val="Example"/>
+      </w:pPr>
+      <w:r>
         <w:rPr>
           <w:lang w:val="de-DE"/>
         </w:rPr>
-      </w:pPr>
+        <w:t>wss = entry.</w:t>
+      </w:r>
       <w:r>
         <w:rPr>
           <w:lang w:val="de-DE"/>
         </w:rPr>
-        <w:t>wss = entry.</w:t>
+        <w:t>Comment</w:t>
       </w:r>
       <w:r>
         <w:rPr>
           <w:lang w:val="de-DE"/>
         </w:rPr>
-        <w:t>Comment</w:t>
+        <w:t>.AvailableWritingSystemIds</w:t>
       </w:r>
       <w:r>
         <w:rPr>
           <w:lang w:val="de-DE"/>
         </w:rPr>
-        <w:t>.AvailableWritingSystemIds</w:t>
+        <w:br/>
+        <w:t>len(wss)</w:t>
       </w:r>
       <w:r>
         <w:rPr>
           <w:lang w:val="de-DE"/>
         </w:rPr>
         <w:br/>
-        <w:t>len(wss)</w:t>
-      </w:r>
-      <w:r>
-        <w:rPr>
-          <w:lang w:val="de-DE"/>
-        </w:rPr>
-        <w:br/>
-      </w:r>
-      <w:r>
-        <w:rPr>
-          <w:lang w:val="de-DE"/>
-        </w:rPr>
         <w:t>3</w:t>
       </w:r>
       <w:r>
@@ -9727,11 +9733,17 @@
       </w:r>
       <w:proofErr w:type="gramStart"/>
       <w:r>
-        <w:t>sl.GetInstance</w:t>
+        <w:t>sl.</w:t>
+      </w:r>
+      <w:r>
+        <w:t>GetService</w:t>
       </w:r>
       <w:proofErr w:type="gramEnd"/>
       <w:r>
-        <w:t>(ILexEntryFactory).Create()</w:t>
+        <w:t>(</w:t>
+      </w:r>
+      <w:r>
+        <w:t>ILexEntryFactory).Create()</w:t>
       </w:r>
     </w:p>
     <w:p>
@@ -9751,11 +9763,17 @@
       </w:r>
       <w:proofErr w:type="gramStart"/>
       <w:r>
-        <w:t>sl.GetInstance</w:t>
+        <w:t>sl.</w:t>
+      </w:r>
+      <w:r>
+        <w:t>GetService</w:t>
       </w:r>
       <w:proofErr w:type="gramEnd"/>
       <w:r>
-        <w:t>(ILexSenseFactory).Create()</w:t>
+        <w:t>(</w:t>
+      </w:r>
+      <w:r>
+        <w:t>ILexSenseFactory).Create()</w:t>
       </w:r>
     </w:p>
     <w:p>
@@ -9930,11 +9948,17 @@
       </w:r>
       <w:proofErr w:type="gramStart"/>
       <w:r>
-        <w:t>sl.GetInstance</w:t>
+        <w:t>sl.</w:t>
+      </w:r>
+      <w:r>
+        <w:t>GetService</w:t>
       </w:r>
       <w:proofErr w:type="gramEnd"/>
       <w:r>
-        <w:t>(ILexEntryRepository)</w:t>
+        <w:t>(</w:t>
+      </w:r>
+      <w:r>
+        <w:t>ILexEntryRepository)</w:t>
       </w:r>
       <w:r>
         <w:br/>
@@ -10044,11 +10068,17 @@
       </w:r>
       <w:proofErr w:type="gramStart"/>
       <w:r>
-        <w:t>sl.GetInstance</w:t>
+        <w:t>sl.</w:t>
+      </w:r>
+      <w:r>
+        <w:t>GetService</w:t>
       </w:r>
       <w:proofErr w:type="gramEnd"/>
       <w:r>
-        <w:t>(ILexEntryRepository).AllInstances()))</w:t>
+        <w:t>(</w:t>
+      </w:r>
+      <w:r>
+        <w:t>ILexEntryRepository).AllInstances()))</w:t>
       </w:r>
     </w:p>
     <w:p>
@@ -10071,11 +10101,17 @@
       </w:r>
       <w:proofErr w:type="gramStart"/>
       <w:r>
-        <w:t>sl.GetInstance</w:t>
+        <w:t>sl.</w:t>
+      </w:r>
+      <w:r>
+        <w:t>GetService</w:t>
       </w:r>
       <w:proofErr w:type="gramEnd"/>
       <w:r>
-        <w:t>(ILexEntryRepository).AllInstances())</w:t>
+        <w:t>(</w:t>
+      </w:r>
+      <w:r>
+        <w:t>ILexEntryRepository).AllInstances())</w:t>
       </w:r>
       <w:r>
         <w:br/>
@@ -10107,11 +10143,17 @@
       </w:r>
       <w:proofErr w:type="gramStart"/>
       <w:r>
-        <w:t>sl.GetInstance</w:t>
+        <w:t>sl.</w:t>
+      </w:r>
+      <w:r>
+        <w:t>GetService</w:t>
       </w:r>
       <w:proofErr w:type="gramEnd"/>
       <w:r>
-        <w:t>(IMorphTypeRepository)</w:t>
+        <w:t>(</w:t>
+      </w:r>
+      <w:r>
+        <w:t>IMorphTypeRepository)</w:t>
       </w:r>
       <w:r>
         <w:br/>
@@ -10187,11 +10229,17 @@
       </w:r>
       <w:proofErr w:type="gramStart"/>
       <w:r>
-        <w:t>sl.GetInstance</w:t>
+        <w:t>sl.</w:t>
+      </w:r>
+      <w:r>
+        <w:t>GetService</w:t>
       </w:r>
       <w:proofErr w:type="gramEnd"/>
       <w:r>
-        <w:t>(IMoStemAllomorphFactory).Create()</w:t>
+        <w:t>(</w:t>
+      </w:r>
+      <w:r>
+        <w:t>IMoStemAllomorphFactory).Create()</w:t>
       </w:r>
       <w:r>
         <w:br/>
@@ -10409,11 +10457,17 @@
       </w:r>
       <w:proofErr w:type="gramStart"/>
       <w:r>
-        <w:t>sl.GetInstance</w:t>
+        <w:t>sl.</w:t>
+      </w:r>
+      <w:r>
+        <w:t>GetService</w:t>
       </w:r>
       <w:proofErr w:type="gramEnd"/>
       <w:r>
-        <w:t>(ILexSenseFactory).Create()</w:t>
+        <w:t>(</w:t>
+      </w:r>
+      <w:r>
+        <w:t>ILexSenseFactory).Create()</w:t>
       </w:r>
       <w:r>
         <w:br/>
@@ -10445,11 +10499,17 @@
       </w:r>
       <w:proofErr w:type="gramStart"/>
       <w:r>
-        <w:t>sl.GetInstance</w:t>
+        <w:t>sl.</w:t>
+      </w:r>
+      <w:r>
+        <w:t>GetService</w:t>
       </w:r>
       <w:proofErr w:type="gramEnd"/>
       <w:r>
-        <w:t>(ILexSenseFactory).Create()</w:t>
+        <w:t>(</w:t>
+      </w:r>
+      <w:r>
+        <w:t>ILexSenseFactory).Create()</w:t>
       </w:r>
       <w:r>
         <w:br/>
@@ -10915,11 +10975,17 @@
       </w:r>
       <w:proofErr w:type="gramStart"/>
       <w:r>
-        <w:t>sl.GetInstance</w:t>
+        <w:t>sl.</w:t>
+      </w:r>
+      <w:r>
+        <w:t>GetService</w:t>
       </w:r>
       <w:proofErr w:type="gramEnd"/>
       <w:r>
-        <w:t>(IMoStemMsaFactory).Create()</w:t>
+        <w:t>(</w:t>
+      </w:r>
+      <w:r>
+        <w:t>IMoStemMsaFactory).Create()</w:t>
       </w:r>
       <w:r>
         <w:br/>
@@ -11211,7 +11277,13 @@
       </w:r>
       <w:r>
         <w:br/>
-        <w:t>semdomRepo = sl.GetInstance(ICmSemanticDomainRepository)</w:t>
+        <w:t>semdomRepo = sl.</w:t>
+      </w:r>
+      <w:r>
+        <w:t>GetService(</w:t>
+      </w:r>
+      <w:r>
+        <w:t>ICmSemanticDomainRepository)</w:t>
       </w:r>
       <w:r>
         <w:br/>
@@ -12820,7 +12892,13 @@
       </w:r>
       <w:r>
         <w:br/>
-        <w:t>sttext = sl.GetInstance(IStTextRepository).GetObject(sttextHvo)</w:t>
+        <w:t>sttext = sl.</w:t>
+      </w:r>
+      <w:r>
+        <w:t>GetService(</w:t>
+      </w:r>
+      <w:r>
+        <w:t>IStTextRepository).GetObject(sttextHvo)</w:t>
       </w:r>
     </w:p>
     <w:p>
@@ -12967,7 +13045,13 @@
       </w:r>
       <w:r>
         <w:br/>
-        <w:t>pos = sl.GetInstance(ICmPossibilityRepository).GetObject(posflid)</w:t>
+        <w:t>pos = sl.</w:t>
+      </w:r>
+      <w:r>
+        <w:t>GetService(</w:t>
+      </w:r>
+      <w:r>
+        <w:t>ICmPossibilityRepository).GetObject(posflid)</w:t>
       </w:r>
       <w:r>
         <w:br/>
@@ -13184,7 +13268,13 @@
         <w:br/>
       </w:r>
       <w:r>
-        <w:t>pos = sl.GetInstance(ICmPossibilityRepository).GetObject(posflid)</w:t>
+        <w:t>pos = sl.</w:t>
+      </w:r>
+      <w:r>
+        <w:t>GetService(</w:t>
+      </w:r>
+      <w:r>
+        <w:t>ICmPossibilityRepository).GetObject(posflid)</w:t>
       </w:r>
       <w:r>
         <w:br/>
@@ -13841,7 +13931,13 @@
       </w:r>
       <w:r>
         <w:br/>
-        <w:t>entry = sl.GetInstance(ILexEntryFactory).Create()</w:t>
+        <w:t>entry = sl.</w:t>
+      </w:r>
+      <w:r>
+        <w:t>GetService(</w:t>
+      </w:r>
+      <w:r>
+        <w:t>ILexEntryFactory).Create()</w:t>
       </w:r>
       <w:r>
         <w:br/>
@@ -13849,7 +13945,13 @@
       </w:r>
       <w:r>
         <w:br/>
-        <w:t>stemAllo = sl.GetInstance(IMoStemAllomorphFactory).Create()</w:t>
+        <w:t>stemAllo = sl.</w:t>
+      </w:r>
+      <w:r>
+        <w:t>GetService(</w:t>
+      </w:r>
+      <w:r>
+        <w:t>IMoStemAllomorphFactory).Create()</w:t>
       </w:r>
       <w:r>
         <w:br/>
@@ -13878,7 +13980,13 @@
       </w:r>
       <w:r>
         <w:br/>
-        <w:t>stemMsa = sl.GetInstance(IMoStemMsaFactory).Create()</w:t>
+        <w:t>stemMsa = sl.</w:t>
+      </w:r>
+      <w:r>
+        <w:t>GetService(</w:t>
+      </w:r>
+      <w:r>
+        <w:t>IMoStemMsaFactory).Create()</w:t>
       </w:r>
       <w:r>
         <w:br/>
@@ -13898,7 +14006,13 @@
       </w:r>
       <w:r>
         <w:br/>
-        <w:t>sense = sl.GetInstance(ILexSenseFactory).Create()</w:t>
+        <w:t>sense = sl.</w:t>
+      </w:r>
+      <w:r>
+        <w:t>GetService(</w:t>
+      </w:r>
+      <w:r>
+        <w:t>ILexSenseFactory).Create()</w:t>
       </w:r>
       <w:r>
         <w:br/>
@@ -13937,7 +14051,13 @@
       </w:r>
       <w:r>
         <w:lastRenderedPageBreak/>
-        <w:t>example = sl.GetInstance(ILexExampleSentenceFactory).Create()</w:t>
+        <w:t>example = sl.</w:t>
+      </w:r>
+      <w:r>
+        <w:t>GetService(</w:t>
+      </w:r>
+      <w:r>
+        <w:t>ILexExampleSentenceFactory).Create()</w:t>
       </w:r>
       <w:r>
         <w:br/>
@@ -13961,7 +14081,13 @@
       </w:r>
       <w:r>
         <w:br/>
-        <w:t>translation = sl.GetInstance(ICmTranslationFactory).Create(example, freeTrans)</w:t>
+        <w:t>translation = sl.</w:t>
+      </w:r>
+      <w:r>
+        <w:t>GetService(</w:t>
+      </w:r>
+      <w:r>
+        <w:t>ICmTranslationFactory).Create(example, freeTrans)</w:t>
       </w:r>
       <w:r>
         <w:br/>
@@ -13999,11 +14125,17 @@
         <w:t>sl</w:t>
       </w:r>
       <w:r>
-        <w:t>.GetInstance</w:t>
+        <w:t>.</w:t>
+      </w:r>
+      <w:r>
+        <w:t>GetService</w:t>
       </w:r>
       <w:proofErr w:type="gramEnd"/>
       <w:r>
-        <w:t>(ILexEntryFactory).Create()</w:t>
+        <w:t>(</w:t>
+      </w:r>
+      <w:r>
+        <w:t>ILexEntryFactory).Create()</w:t>
       </w:r>
     </w:p>
     <w:p>
@@ -14146,11 +14278,17 @@
       </w:r>
       <w:proofErr w:type="gramStart"/>
       <w:r>
-        <w:t>sl.GetInstance</w:t>
+        <w:t>sl.</w:t>
+      </w:r>
+      <w:r>
+        <w:t>GetService</w:t>
       </w:r>
       <w:proofErr w:type="gramEnd"/>
       <w:r>
-        <w:t>(IMoStemAllomorphFactory).Create()</w:t>
+        <w:t>(</w:t>
+      </w:r>
+      <w:r>
+        <w:t>IMoStemAllomorphFactory).Create()</w:t>
       </w:r>
       <w:r>
         <w:br/>
@@ -14267,11 +14405,17 @@
       </w:r>
       <w:proofErr w:type="gramStart"/>
       <w:r>
-        <w:t>sl.GetInstance</w:t>
+        <w:t>sl.</w:t>
+      </w:r>
+      <w:r>
+        <w:t>GetService</w:t>
       </w:r>
       <w:proofErr w:type="gramEnd"/>
       <w:r>
-        <w:t>(IMoStemMsaFactory).Create()</w:t>
+        <w:t>(</w:t>
+      </w:r>
+      <w:r>
+        <w:t>IMoStemMsaFactory).Create()</w:t>
       </w:r>
       <w:r>
         <w:br/>
@@ -14401,11 +14545,17 @@
       </w:r>
       <w:proofErr w:type="gramStart"/>
       <w:r>
-        <w:t>sl.GetInstance</w:t>
+        <w:t>sl.</w:t>
+      </w:r>
+      <w:r>
+        <w:t>GetService</w:t>
       </w:r>
       <w:proofErr w:type="gramEnd"/>
       <w:r>
-        <w:t>(ILexSenseFactory).Create()</w:t>
+        <w:t>(</w:t>
+      </w:r>
+      <w:r>
+        <w:t>ILexSenseFactory).Create()</w:t>
       </w:r>
       <w:r>
         <w:br/>
@@ -14593,11 +14743,17 @@
       </w:r>
       <w:proofErr w:type="gramStart"/>
       <w:r>
-        <w:t>sl.GetInstance</w:t>
+        <w:t>sl.</w:t>
+      </w:r>
+      <w:r>
+        <w:t>GetService</w:t>
       </w:r>
       <w:proofErr w:type="gramEnd"/>
       <w:r>
-        <w:t>(ILexExampleSentenceFactory).Create()</w:t>
+        <w:t>(</w:t>
+      </w:r>
+      <w:r>
+        <w:t>ILexExampleSentenceFactory).Create()</w:t>
       </w:r>
       <w:r>
         <w:br/>
@@ -14746,7 +14902,13 @@
       </w:r>
       <w:r>
         <w:br/>
-        <w:t>translation = sl.GetInstance(ICmTranslationFactory).Create(example, freeTrans)</w:t>
+        <w:t>translation = sl.</w:t>
+      </w:r>
+      <w:r>
+        <w:t>GetService(</w:t>
+      </w:r>
+      <w:r>
+        <w:t>ICmTranslationFactory).Create(example, freeTrans)</w:t>
       </w:r>
       <w:r>
         <w:br/>
@@ -14912,7 +15074,13 @@
       </w:r>
       <w:r>
         <w:br/>
-        <w:t>entry = sl.GetInstance(ILexEntryFactory).Create()</w:t>
+        <w:t>entry = sl.</w:t>
+      </w:r>
+      <w:r>
+        <w:t>GetService(</w:t>
+      </w:r>
+      <w:r>
+        <w:t>ILexEntryFactory).Create()</w:t>
       </w:r>
       <w:r>
         <w:br/>
@@ -14920,7 +15088,13 @@
       </w:r>
       <w:r>
         <w:br/>
-        <w:t>stemAllo = sl.GetInstance(IMoStemAllomorphFactory).Create()</w:t>
+        <w:t>stemAllo = sl.</w:t>
+      </w:r>
+      <w:r>
+        <w:t>GetService(</w:t>
+      </w:r>
+      <w:r>
+        <w:t>IMoStemAllomorphFactory).Create()</w:t>
       </w:r>
       <w:r>
         <w:br/>
@@ -14953,7 +15127,13 @@
       </w:r>
       <w:r>
         <w:br/>
-        <w:t>stemMsa = sl.GetInstance(IMoStemMsaFactory).Create()</w:t>
+        <w:t>stemMsa = sl.</w:t>
+      </w:r>
+      <w:r>
+        <w:t>GetService(</w:t>
+      </w:r>
+      <w:r>
+        <w:t>IMoStemMsaFactory).Create()</w:t>
       </w:r>
       <w:r>
         <w:br/>
@@ -14973,7 +15153,13 @@
       </w:r>
       <w:r>
         <w:br/>
-        <w:t>sense = sl.GetInstance(ILexSenseFactory).Create()</w:t>
+        <w:t>sense = sl.</w:t>
+      </w:r>
+      <w:r>
+        <w:t>GetService(</w:t>
+      </w:r>
+      <w:r>
+        <w:t>ILexSenseFactory).Create()</w:t>
       </w:r>
       <w:r>
         <w:br/>
@@ -15004,7 +15190,13 @@
       </w:r>
       <w:r>
         <w:br/>
-        <w:t>wordform = sl.GetInstance(IWfiWordformFactory).Create()</w:t>
+        <w:t>wordform = sl.</w:t>
+      </w:r>
+      <w:r>
+        <w:t>GetService(</w:t>
+      </w:r>
+      <w:r>
+        <w:t>IWfiWordformFactory).Create()</w:t>
       </w:r>
       <w:r>
         <w:br/>
@@ -15022,7 +15214,13 @@
       </w:r>
       <w:r>
         <w:br/>
-        <w:t>analysis = sl.GetInstance(IWfiAnalysisFactory).Create()</w:t>
+        <w:t>analysis = sl.</w:t>
+      </w:r>
+      <w:r>
+        <w:t>GetService(</w:t>
+      </w:r>
+      <w:r>
+        <w:t>IWfiAnalysisFactory).Create()</w:t>
       </w:r>
       <w:r>
         <w:br/>
@@ -15038,7 +15236,13 @@
       </w:r>
       <w:r>
         <w:br/>
-        <w:t>agevalRepo = sl.GetInstance(ICmAgentEvaluationRepository)</w:t>
+        <w:t>agevalRepo = sl.</w:t>
+      </w:r>
+      <w:r>
+        <w:t>GetService(</w:t>
+      </w:r>
+      <w:r>
+        <w:t>ICmAgentEvaluationRepository)</w:t>
       </w:r>
       <w:r>
         <w:br/>
@@ -15054,7 +15258,13 @@
       </w:r>
       <w:r>
         <w:br/>
-        <w:t>wgloss = sl.GetInstance(IWfiGlossFactory).Create()</w:t>
+        <w:t>wgloss = sl.</w:t>
+      </w:r>
+      <w:r>
+        <w:t>GetService(</w:t>
+      </w:r>
+      <w:r>
+        <w:t>IWfiGlossFactory).Create()</w:t>
       </w:r>
       <w:r>
         <w:br/>
@@ -15076,7 +15286,13 @@
       </w:r>
       <w:r>
         <w:br/>
-        <w:t>wmb = sl.GetInstance(IWfiMorphBundleFactory).Create()</w:t>
+        <w:t>wmb = sl.</w:t>
+      </w:r>
+      <w:r>
+        <w:t>GetService(</w:t>
+      </w:r>
+      <w:r>
+        <w:t>IWfiMorphBundleFactory).Create()</w:t>
       </w:r>
       <w:r>
         <w:br/>
@@ -15115,7 +15331,13 @@
       </w:r>
       <w:r>
         <w:br/>
-        <w:t>itext = sl.GetInstance(ITextFactory).Create()</w:t>
+        <w:t>itext = sl.</w:t>
+      </w:r>
+      <w:r>
+        <w:t>GetService(</w:t>
+      </w:r>
+      <w:r>
+        <w:t>ITextFactory).Create()</w:t>
       </w:r>
       <w:r>
         <w:br/>
@@ -15136,7 +15358,13 @@
       </w:r>
       <w:r>
         <w:br/>
-        <w:t>sttext = sl.GetInstance(IStTextFactory).Create()</w:t>
+        <w:t>sttext = sl.</w:t>
+      </w:r>
+      <w:r>
+        <w:t>GetService(</w:t>
+      </w:r>
+      <w:r>
+        <w:t>IStTextFactory).Create()</w:t>
       </w:r>
       <w:r>
         <w:br/>
@@ -15148,7 +15376,13 @@
       </w:r>
       <w:r>
         <w:br/>
-        <w:t>stpara = sl.GetInstance(IStTxtParaFactory).Create()</w:t>
+        <w:t>stpara = sl.</w:t>
+      </w:r>
+      <w:r>
+        <w:t>GetService(</w:t>
+      </w:r>
+      <w:r>
+        <w:t>IStTxtParaFactory).Create()</w:t>
       </w:r>
       <w:r>
         <w:br/>
@@ -15170,7 +15404,13 @@
       </w:r>
       <w:r>
         <w:br/>
-        <w:t>seg = sl.GetInstance(ISegmentFactory).Create()</w:t>
+        <w:t>seg = sl.</w:t>
+      </w:r>
+      <w:r>
+        <w:t>GetService(</w:t>
+      </w:r>
+      <w:r>
+        <w:t>ISegmentFactory).Create()</w:t>
       </w:r>
       <w:r>
         <w:br/>
@@ -15266,7 +15506,7 @@
       <w:rPr>
         <w:noProof/>
       </w:rPr>
-      <w:t>7/17/2024</w:t>
+      <w:t>8/15/2024</w:t>
     </w:r>
     <w:r>
       <w:fldChar w:fldCharType="end"/>
@@ -15313,7 +15553,7 @@
         <w:rStyle w:val="PageNumber"/>
         <w:noProof/>
       </w:rPr>
-      <w:t>7/17/2024</w:t>
+      <w:t>8/15/2024</w:t>
     </w:r>
     <w:r>
       <w:rPr>
@@ -19338,7 +19578,7 @@
 </file>
 
 <file path=customXml/itemProps1.xml><?xml version="1.0" encoding="utf-8"?>
-<ds:datastoreItem xmlns:ds="http://schemas.openxmlformats.org/officeDocument/2006/customXml" ds:itemID="{D5543AC2-F5F3-4B83-B88C-46907D7F3377}">
+<ds:datastoreItem xmlns:ds="http://schemas.openxmlformats.org/officeDocument/2006/customXml" ds:itemID="{4D7E2AD8-30F0-40E2-A3D6-3A2435148FA5}">
   <ds:schemaRefs>
     <ds:schemaRef ds:uri="http://schemas.openxmlformats.org/officeDocument/2006/bibliography"/>
   </ds:schemaRefs>

</xml_diff>